<commit_message>
style(ui): translate admin/user login and landing pages to vietnamese
</commit_message>
<xml_diff>
--- a/HospitalQualityDashboard-demo/Tai_Lieu/Phieu-Theo-doi-Tien-do-TTTN.docx
+++ b/HospitalQualityDashboard-demo/Tai_Lieu/Phieu-Theo-doi-Tien-do-TTTN.docx
@@ -1083,6 +1083,10 @@
             <w:pPr>
               <w:ind w:left="0" w:hanging="2"/>
             </w:pPr>
+            <w:r/>
+            <w:r>
+              <w:t>Cải tiến giao diện Admin (phân trang khoa/phòng, combobox tìm kiếm thông minh, dropdown thông báo, sidebar gom nhóm); nâng cấp Dashboard (thêm bộ lọc kỳ và chức năng so sánh KPI chi tiết giữa các kỳ báo cáo); tối ưu form hồ sơ nhân viên, hỗ trợ tự động tạo tài khoản; tích hợp thông báo khóa kỳ và trang quản lý lịch sử hệ thống (system log).</w:t>
+            </w:r>
           </w:p>
         </w:tc>
       </w:tr>
@@ -1115,6 +1119,9 @@
               <w:ind w:left="0" w:hanging="2"/>
               <w:jc w:val="center"/>
             </w:pPr>
+            <w:r>
+              <w:t>13/07/2026 – 19/07/2026</w:t>
+            </w:r>
           </w:p>
         </w:tc>
         <w:tc>
@@ -1125,6 +1132,10 @@
             <w:pPr>
               <w:ind w:left="0" w:hanging="2"/>
             </w:pPr>
+            <w:r/>
+            <w:r>
+              <w:t>Xây dựng ràng buộc dữ liệu chi tiết cho chỉ số và khoa/phòng; phát triển cơ chế chặn hoạt động mới đối với các khoa/phòng đã bị khóa; hiện thực hóa cơ chế ghi nhớ đăng nhập (Remember Me) bằng persistent token; Việt hóa các nhãn công thức và thuật ngữ y tế chuyên ngành trên form nhập báo cáo; thiết kế và lập trình phân quyền theo vai trò (RBAC), bổ sung vai trò Ban Giám đốc.</w:t>
+            </w:r>
           </w:p>
         </w:tc>
       </w:tr>

</xml_diff>